<commit_message>
bài tập buổi 1
</commit_message>
<xml_diff>
--- a/TESTER/BÁO CÁO LỖI MICROSOFT PAINT.docx
+++ b/TESTER/BÁO CÁO LỖI MICROSOFT PAINT.docx
@@ -4925,15 +4925,10 @@
     <w:tbl>
       <w:tblPr>
         <w:tblStyle w:val="TableGrid"/>
-        <w:tblW w:w="18700" w:type="dxa"/>
+        <w:tblW w:w="9350" w:type="dxa"/>
         <w:tblLook w:val="04A0" w:firstRow="1" w:lastRow="0" w:firstColumn="1" w:lastColumn="0" w:noHBand="0" w:noVBand="1"/>
       </w:tblPr>
       <w:tblGrid>
-        <w:gridCol w:w="1870"/>
-        <w:gridCol w:w="1870"/>
-        <w:gridCol w:w="1870"/>
-        <w:gridCol w:w="1870"/>
-        <w:gridCol w:w="1870"/>
         <w:gridCol w:w="1870"/>
         <w:gridCol w:w="1870"/>
         <w:gridCol w:w="1870"/>
@@ -5111,111 +5106,6 @@
             </w:r>
           </w:p>
         </w:tc>
-        <w:tc>
-          <w:tcPr>
-            <w:tcW w:w="1870" w:type="dxa"/>
-          </w:tcPr>
-          <w:p>
-            <w:pPr>
-              <w:spacing w:line="360" w:lineRule="auto"/>
-              <w:ind w:firstLine="0"/>
-              <w:jc w:val="left"/>
-              <w:rPr>
-                <w:rFonts w:ascii="Times New Roman" w:eastAsia="Times New Roman" w:hAnsi="Times New Roman" w:cs="Times New Roman"/>
-                <w:b/>
-                <w:bCs/>
-                <w:kern w:val="0"/>
-                <w:sz w:val="26"/>
-                <w:szCs w:val="26"/>
-                <w14:ligatures w14:val="none"/>
-              </w:rPr>
-            </w:pPr>
-          </w:p>
-        </w:tc>
-        <w:tc>
-          <w:tcPr>
-            <w:tcW w:w="1870" w:type="dxa"/>
-          </w:tcPr>
-          <w:p>
-            <w:pPr>
-              <w:spacing w:line="360" w:lineRule="auto"/>
-              <w:ind w:firstLine="0"/>
-              <w:jc w:val="left"/>
-              <w:rPr>
-                <w:rFonts w:ascii="Times New Roman" w:eastAsia="Times New Roman" w:hAnsi="Times New Roman" w:cs="Times New Roman"/>
-                <w:b/>
-                <w:bCs/>
-                <w:kern w:val="0"/>
-                <w:sz w:val="26"/>
-                <w:szCs w:val="26"/>
-                <w14:ligatures w14:val="none"/>
-              </w:rPr>
-            </w:pPr>
-          </w:p>
-        </w:tc>
-        <w:tc>
-          <w:tcPr>
-            <w:tcW w:w="1870" w:type="dxa"/>
-          </w:tcPr>
-          <w:p>
-            <w:pPr>
-              <w:spacing w:line="360" w:lineRule="auto"/>
-              <w:ind w:firstLine="0"/>
-              <w:jc w:val="left"/>
-              <w:rPr>
-                <w:rFonts w:ascii="Times New Roman" w:eastAsia="Times New Roman" w:hAnsi="Times New Roman" w:cs="Times New Roman"/>
-                <w:b/>
-                <w:bCs/>
-                <w:kern w:val="0"/>
-                <w:sz w:val="26"/>
-                <w:szCs w:val="26"/>
-                <w14:ligatures w14:val="none"/>
-              </w:rPr>
-            </w:pPr>
-          </w:p>
-        </w:tc>
-        <w:tc>
-          <w:tcPr>
-            <w:tcW w:w="1870" w:type="dxa"/>
-          </w:tcPr>
-          <w:p>
-            <w:pPr>
-              <w:spacing w:line="360" w:lineRule="auto"/>
-              <w:ind w:firstLine="0"/>
-              <w:jc w:val="left"/>
-              <w:rPr>
-                <w:rFonts w:ascii="Times New Roman" w:eastAsia="Times New Roman" w:hAnsi="Times New Roman" w:cs="Times New Roman"/>
-                <w:b/>
-                <w:bCs/>
-                <w:kern w:val="0"/>
-                <w:sz w:val="26"/>
-                <w:szCs w:val="26"/>
-                <w14:ligatures w14:val="none"/>
-              </w:rPr>
-            </w:pPr>
-          </w:p>
-        </w:tc>
-        <w:tc>
-          <w:tcPr>
-            <w:tcW w:w="1870" w:type="dxa"/>
-          </w:tcPr>
-          <w:p>
-            <w:pPr>
-              <w:spacing w:line="360" w:lineRule="auto"/>
-              <w:ind w:firstLine="0"/>
-              <w:jc w:val="left"/>
-              <w:rPr>
-                <w:rFonts w:ascii="Times New Roman" w:eastAsia="Times New Roman" w:hAnsi="Times New Roman" w:cs="Times New Roman"/>
-                <w:b/>
-                <w:bCs/>
-                <w:kern w:val="0"/>
-                <w:sz w:val="26"/>
-                <w:szCs w:val="26"/>
-                <w14:ligatures w14:val="none"/>
-              </w:rPr>
-            </w:pPr>
-          </w:p>
-        </w:tc>
       </w:tr>
       <w:tr>
         <w:tc>
@@ -5376,111 +5266,6 @@
               </w:rPr>
               <w:t>Mới</w:t>
             </w:r>
-          </w:p>
-        </w:tc>
-        <w:tc>
-          <w:tcPr>
-            <w:tcW w:w="1870" w:type="dxa"/>
-          </w:tcPr>
-          <w:p>
-            <w:pPr>
-              <w:spacing w:line="360" w:lineRule="auto"/>
-              <w:ind w:firstLine="0"/>
-              <w:jc w:val="left"/>
-              <w:rPr>
-                <w:rFonts w:ascii="Times New Roman" w:eastAsia="Times New Roman" w:hAnsi="Times New Roman" w:cs="Times New Roman"/>
-                <w:b/>
-                <w:bCs/>
-                <w:kern w:val="0"/>
-                <w:sz w:val="26"/>
-                <w:szCs w:val="26"/>
-                <w14:ligatures w14:val="none"/>
-              </w:rPr>
-            </w:pPr>
-          </w:p>
-        </w:tc>
-        <w:tc>
-          <w:tcPr>
-            <w:tcW w:w="1870" w:type="dxa"/>
-          </w:tcPr>
-          <w:p>
-            <w:pPr>
-              <w:spacing w:line="360" w:lineRule="auto"/>
-              <w:ind w:firstLine="0"/>
-              <w:jc w:val="left"/>
-              <w:rPr>
-                <w:rFonts w:ascii="Times New Roman" w:eastAsia="Times New Roman" w:hAnsi="Times New Roman" w:cs="Times New Roman"/>
-                <w:b/>
-                <w:bCs/>
-                <w:kern w:val="0"/>
-                <w:sz w:val="26"/>
-                <w:szCs w:val="26"/>
-                <w14:ligatures w14:val="none"/>
-              </w:rPr>
-            </w:pPr>
-          </w:p>
-        </w:tc>
-        <w:tc>
-          <w:tcPr>
-            <w:tcW w:w="1870" w:type="dxa"/>
-          </w:tcPr>
-          <w:p>
-            <w:pPr>
-              <w:spacing w:line="360" w:lineRule="auto"/>
-              <w:ind w:firstLine="0"/>
-              <w:jc w:val="left"/>
-              <w:rPr>
-                <w:rFonts w:ascii="Times New Roman" w:eastAsia="Times New Roman" w:hAnsi="Times New Roman" w:cs="Times New Roman"/>
-                <w:b/>
-                <w:bCs/>
-                <w:kern w:val="0"/>
-                <w:sz w:val="26"/>
-                <w:szCs w:val="26"/>
-                <w14:ligatures w14:val="none"/>
-              </w:rPr>
-            </w:pPr>
-          </w:p>
-        </w:tc>
-        <w:tc>
-          <w:tcPr>
-            <w:tcW w:w="1870" w:type="dxa"/>
-          </w:tcPr>
-          <w:p>
-            <w:pPr>
-              <w:spacing w:line="360" w:lineRule="auto"/>
-              <w:ind w:firstLine="0"/>
-              <w:jc w:val="left"/>
-              <w:rPr>
-                <w:rFonts w:ascii="Times New Roman" w:eastAsia="Times New Roman" w:hAnsi="Times New Roman" w:cs="Times New Roman"/>
-                <w:b/>
-                <w:bCs/>
-                <w:kern w:val="0"/>
-                <w:sz w:val="26"/>
-                <w:szCs w:val="26"/>
-                <w14:ligatures w14:val="none"/>
-              </w:rPr>
-            </w:pPr>
-          </w:p>
-        </w:tc>
-        <w:tc>
-          <w:tcPr>
-            <w:tcW w:w="1870" w:type="dxa"/>
-          </w:tcPr>
-          <w:p>
-            <w:pPr>
-              <w:spacing w:line="360" w:lineRule="auto"/>
-              <w:ind w:firstLine="0"/>
-              <w:jc w:val="left"/>
-              <w:rPr>
-                <w:rFonts w:ascii="Times New Roman" w:eastAsia="Times New Roman" w:hAnsi="Times New Roman" w:cs="Times New Roman"/>
-                <w:b/>
-                <w:bCs/>
-                <w:kern w:val="0"/>
-                <w:sz w:val="26"/>
-                <w:szCs w:val="26"/>
-                <w14:ligatures w14:val="none"/>
-              </w:rPr>
-            </w:pPr>
           </w:p>
         </w:tc>
       </w:tr>
@@ -5645,111 +5430,6 @@
             </w:r>
           </w:p>
         </w:tc>
-        <w:tc>
-          <w:tcPr>
-            <w:tcW w:w="1870" w:type="dxa"/>
-          </w:tcPr>
-          <w:p>
-            <w:pPr>
-              <w:spacing w:line="360" w:lineRule="auto"/>
-              <w:ind w:firstLine="0"/>
-              <w:jc w:val="left"/>
-              <w:rPr>
-                <w:rFonts w:ascii="Times New Roman" w:eastAsia="Times New Roman" w:hAnsi="Times New Roman" w:cs="Times New Roman"/>
-                <w:b/>
-                <w:bCs/>
-                <w:kern w:val="0"/>
-                <w:sz w:val="26"/>
-                <w:szCs w:val="26"/>
-                <w14:ligatures w14:val="none"/>
-              </w:rPr>
-            </w:pPr>
-          </w:p>
-        </w:tc>
-        <w:tc>
-          <w:tcPr>
-            <w:tcW w:w="1870" w:type="dxa"/>
-          </w:tcPr>
-          <w:p>
-            <w:pPr>
-              <w:spacing w:line="360" w:lineRule="auto"/>
-              <w:ind w:firstLine="0"/>
-              <w:jc w:val="left"/>
-              <w:rPr>
-                <w:rFonts w:ascii="Times New Roman" w:eastAsia="Times New Roman" w:hAnsi="Times New Roman" w:cs="Times New Roman"/>
-                <w:b/>
-                <w:bCs/>
-                <w:kern w:val="0"/>
-                <w:sz w:val="26"/>
-                <w:szCs w:val="26"/>
-                <w14:ligatures w14:val="none"/>
-              </w:rPr>
-            </w:pPr>
-          </w:p>
-        </w:tc>
-        <w:tc>
-          <w:tcPr>
-            <w:tcW w:w="1870" w:type="dxa"/>
-          </w:tcPr>
-          <w:p>
-            <w:pPr>
-              <w:spacing w:line="360" w:lineRule="auto"/>
-              <w:ind w:firstLine="0"/>
-              <w:jc w:val="left"/>
-              <w:rPr>
-                <w:rFonts w:ascii="Times New Roman" w:eastAsia="Times New Roman" w:hAnsi="Times New Roman" w:cs="Times New Roman"/>
-                <w:b/>
-                <w:bCs/>
-                <w:kern w:val="0"/>
-                <w:sz w:val="26"/>
-                <w:szCs w:val="26"/>
-                <w14:ligatures w14:val="none"/>
-              </w:rPr>
-            </w:pPr>
-          </w:p>
-        </w:tc>
-        <w:tc>
-          <w:tcPr>
-            <w:tcW w:w="1870" w:type="dxa"/>
-          </w:tcPr>
-          <w:p>
-            <w:pPr>
-              <w:spacing w:line="360" w:lineRule="auto"/>
-              <w:ind w:firstLine="0"/>
-              <w:jc w:val="left"/>
-              <w:rPr>
-                <w:rFonts w:ascii="Times New Roman" w:eastAsia="Times New Roman" w:hAnsi="Times New Roman" w:cs="Times New Roman"/>
-                <w:b/>
-                <w:bCs/>
-                <w:kern w:val="0"/>
-                <w:sz w:val="26"/>
-                <w:szCs w:val="26"/>
-                <w14:ligatures w14:val="none"/>
-              </w:rPr>
-            </w:pPr>
-          </w:p>
-        </w:tc>
-        <w:tc>
-          <w:tcPr>
-            <w:tcW w:w="1870" w:type="dxa"/>
-          </w:tcPr>
-          <w:p>
-            <w:pPr>
-              <w:spacing w:line="360" w:lineRule="auto"/>
-              <w:ind w:firstLine="0"/>
-              <w:jc w:val="left"/>
-              <w:rPr>
-                <w:rFonts w:ascii="Times New Roman" w:eastAsia="Times New Roman" w:hAnsi="Times New Roman" w:cs="Times New Roman"/>
-                <w:b/>
-                <w:bCs/>
-                <w:kern w:val="0"/>
-                <w:sz w:val="26"/>
-                <w:szCs w:val="26"/>
-                <w14:ligatures w14:val="none"/>
-              </w:rPr>
-            </w:pPr>
-          </w:p>
-        </w:tc>
       </w:tr>
       <w:tr>
         <w:tc>
@@ -5910,111 +5590,6 @@
               </w:rPr>
               <w:t>Mới</w:t>
             </w:r>
-          </w:p>
-        </w:tc>
-        <w:tc>
-          <w:tcPr>
-            <w:tcW w:w="1870" w:type="dxa"/>
-          </w:tcPr>
-          <w:p>
-            <w:pPr>
-              <w:spacing w:line="360" w:lineRule="auto"/>
-              <w:ind w:firstLine="0"/>
-              <w:jc w:val="left"/>
-              <w:rPr>
-                <w:rFonts w:ascii="Times New Roman" w:eastAsia="Times New Roman" w:hAnsi="Times New Roman" w:cs="Times New Roman"/>
-                <w:b/>
-                <w:bCs/>
-                <w:kern w:val="0"/>
-                <w:sz w:val="26"/>
-                <w:szCs w:val="26"/>
-                <w14:ligatures w14:val="none"/>
-              </w:rPr>
-            </w:pPr>
-          </w:p>
-        </w:tc>
-        <w:tc>
-          <w:tcPr>
-            <w:tcW w:w="1870" w:type="dxa"/>
-          </w:tcPr>
-          <w:p>
-            <w:pPr>
-              <w:spacing w:line="360" w:lineRule="auto"/>
-              <w:ind w:firstLine="0"/>
-              <w:jc w:val="left"/>
-              <w:rPr>
-                <w:rFonts w:ascii="Times New Roman" w:eastAsia="Times New Roman" w:hAnsi="Times New Roman" w:cs="Times New Roman"/>
-                <w:b/>
-                <w:bCs/>
-                <w:kern w:val="0"/>
-                <w:sz w:val="26"/>
-                <w:szCs w:val="26"/>
-                <w14:ligatures w14:val="none"/>
-              </w:rPr>
-            </w:pPr>
-          </w:p>
-        </w:tc>
-        <w:tc>
-          <w:tcPr>
-            <w:tcW w:w="1870" w:type="dxa"/>
-          </w:tcPr>
-          <w:p>
-            <w:pPr>
-              <w:spacing w:line="360" w:lineRule="auto"/>
-              <w:ind w:firstLine="0"/>
-              <w:jc w:val="left"/>
-              <w:rPr>
-                <w:rFonts w:ascii="Times New Roman" w:eastAsia="Times New Roman" w:hAnsi="Times New Roman" w:cs="Times New Roman"/>
-                <w:b/>
-                <w:bCs/>
-                <w:kern w:val="0"/>
-                <w:sz w:val="26"/>
-                <w:szCs w:val="26"/>
-                <w14:ligatures w14:val="none"/>
-              </w:rPr>
-            </w:pPr>
-          </w:p>
-        </w:tc>
-        <w:tc>
-          <w:tcPr>
-            <w:tcW w:w="1870" w:type="dxa"/>
-          </w:tcPr>
-          <w:p>
-            <w:pPr>
-              <w:spacing w:line="360" w:lineRule="auto"/>
-              <w:ind w:firstLine="0"/>
-              <w:jc w:val="left"/>
-              <w:rPr>
-                <w:rFonts w:ascii="Times New Roman" w:eastAsia="Times New Roman" w:hAnsi="Times New Roman" w:cs="Times New Roman"/>
-                <w:b/>
-                <w:bCs/>
-                <w:kern w:val="0"/>
-                <w:sz w:val="26"/>
-                <w:szCs w:val="26"/>
-                <w14:ligatures w14:val="none"/>
-              </w:rPr>
-            </w:pPr>
-          </w:p>
-        </w:tc>
-        <w:tc>
-          <w:tcPr>
-            <w:tcW w:w="1870" w:type="dxa"/>
-          </w:tcPr>
-          <w:p>
-            <w:pPr>
-              <w:spacing w:line="360" w:lineRule="auto"/>
-              <w:ind w:firstLine="0"/>
-              <w:jc w:val="left"/>
-              <w:rPr>
-                <w:rFonts w:ascii="Times New Roman" w:eastAsia="Times New Roman" w:hAnsi="Times New Roman" w:cs="Times New Roman"/>
-                <w:b/>
-                <w:bCs/>
-                <w:kern w:val="0"/>
-                <w:sz w:val="26"/>
-                <w:szCs w:val="26"/>
-                <w14:ligatures w14:val="none"/>
-              </w:rPr>
-            </w:pPr>
           </w:p>
         </w:tc>
       </w:tr>
@@ -6179,111 +5754,6 @@
             </w:r>
           </w:p>
         </w:tc>
-        <w:tc>
-          <w:tcPr>
-            <w:tcW w:w="1870" w:type="dxa"/>
-          </w:tcPr>
-          <w:p>
-            <w:pPr>
-              <w:spacing w:line="360" w:lineRule="auto"/>
-              <w:ind w:firstLine="0"/>
-              <w:jc w:val="left"/>
-              <w:rPr>
-                <w:rFonts w:ascii="Times New Roman" w:eastAsia="Times New Roman" w:hAnsi="Times New Roman" w:cs="Times New Roman"/>
-                <w:b/>
-                <w:bCs/>
-                <w:kern w:val="0"/>
-                <w:sz w:val="26"/>
-                <w:szCs w:val="26"/>
-                <w14:ligatures w14:val="none"/>
-              </w:rPr>
-            </w:pPr>
-          </w:p>
-        </w:tc>
-        <w:tc>
-          <w:tcPr>
-            <w:tcW w:w="1870" w:type="dxa"/>
-          </w:tcPr>
-          <w:p>
-            <w:pPr>
-              <w:spacing w:line="360" w:lineRule="auto"/>
-              <w:ind w:firstLine="0"/>
-              <w:jc w:val="left"/>
-              <w:rPr>
-                <w:rFonts w:ascii="Times New Roman" w:eastAsia="Times New Roman" w:hAnsi="Times New Roman" w:cs="Times New Roman"/>
-                <w:b/>
-                <w:bCs/>
-                <w:kern w:val="0"/>
-                <w:sz w:val="26"/>
-                <w:szCs w:val="26"/>
-                <w14:ligatures w14:val="none"/>
-              </w:rPr>
-            </w:pPr>
-          </w:p>
-        </w:tc>
-        <w:tc>
-          <w:tcPr>
-            <w:tcW w:w="1870" w:type="dxa"/>
-          </w:tcPr>
-          <w:p>
-            <w:pPr>
-              <w:spacing w:line="360" w:lineRule="auto"/>
-              <w:ind w:firstLine="0"/>
-              <w:jc w:val="left"/>
-              <w:rPr>
-                <w:rFonts w:ascii="Times New Roman" w:eastAsia="Times New Roman" w:hAnsi="Times New Roman" w:cs="Times New Roman"/>
-                <w:b/>
-                <w:bCs/>
-                <w:kern w:val="0"/>
-                <w:sz w:val="26"/>
-                <w:szCs w:val="26"/>
-                <w14:ligatures w14:val="none"/>
-              </w:rPr>
-            </w:pPr>
-          </w:p>
-        </w:tc>
-        <w:tc>
-          <w:tcPr>
-            <w:tcW w:w="1870" w:type="dxa"/>
-          </w:tcPr>
-          <w:p>
-            <w:pPr>
-              <w:spacing w:line="360" w:lineRule="auto"/>
-              <w:ind w:firstLine="0"/>
-              <w:jc w:val="left"/>
-              <w:rPr>
-                <w:rFonts w:ascii="Times New Roman" w:eastAsia="Times New Roman" w:hAnsi="Times New Roman" w:cs="Times New Roman"/>
-                <w:b/>
-                <w:bCs/>
-                <w:kern w:val="0"/>
-                <w:sz w:val="26"/>
-                <w:szCs w:val="26"/>
-                <w14:ligatures w14:val="none"/>
-              </w:rPr>
-            </w:pPr>
-          </w:p>
-        </w:tc>
-        <w:tc>
-          <w:tcPr>
-            <w:tcW w:w="1870" w:type="dxa"/>
-          </w:tcPr>
-          <w:p>
-            <w:pPr>
-              <w:spacing w:line="360" w:lineRule="auto"/>
-              <w:ind w:firstLine="0"/>
-              <w:jc w:val="left"/>
-              <w:rPr>
-                <w:rFonts w:ascii="Times New Roman" w:eastAsia="Times New Roman" w:hAnsi="Times New Roman" w:cs="Times New Roman"/>
-                <w:b/>
-                <w:bCs/>
-                <w:kern w:val="0"/>
-                <w:sz w:val="26"/>
-                <w:szCs w:val="26"/>
-                <w14:ligatures w14:val="none"/>
-              </w:rPr>
-            </w:pPr>
-          </w:p>
-        </w:tc>
       </w:tr>
       <w:tr>
         <w:tc>
@@ -6444,111 +5914,6 @@
               </w:rPr>
               <w:t>Mới</w:t>
             </w:r>
-          </w:p>
-        </w:tc>
-        <w:tc>
-          <w:tcPr>
-            <w:tcW w:w="1870" w:type="dxa"/>
-          </w:tcPr>
-          <w:p>
-            <w:pPr>
-              <w:spacing w:line="360" w:lineRule="auto"/>
-              <w:ind w:firstLine="0"/>
-              <w:jc w:val="left"/>
-              <w:rPr>
-                <w:rFonts w:ascii="Times New Roman" w:eastAsia="Times New Roman" w:hAnsi="Times New Roman" w:cs="Times New Roman"/>
-                <w:b/>
-                <w:bCs/>
-                <w:kern w:val="0"/>
-                <w:sz w:val="26"/>
-                <w:szCs w:val="26"/>
-                <w14:ligatures w14:val="none"/>
-              </w:rPr>
-            </w:pPr>
-          </w:p>
-        </w:tc>
-        <w:tc>
-          <w:tcPr>
-            <w:tcW w:w="1870" w:type="dxa"/>
-          </w:tcPr>
-          <w:p>
-            <w:pPr>
-              <w:spacing w:line="360" w:lineRule="auto"/>
-              <w:ind w:firstLine="0"/>
-              <w:jc w:val="left"/>
-              <w:rPr>
-                <w:rFonts w:ascii="Times New Roman" w:eastAsia="Times New Roman" w:hAnsi="Times New Roman" w:cs="Times New Roman"/>
-                <w:b/>
-                <w:bCs/>
-                <w:kern w:val="0"/>
-                <w:sz w:val="26"/>
-                <w:szCs w:val="26"/>
-                <w14:ligatures w14:val="none"/>
-              </w:rPr>
-            </w:pPr>
-          </w:p>
-        </w:tc>
-        <w:tc>
-          <w:tcPr>
-            <w:tcW w:w="1870" w:type="dxa"/>
-          </w:tcPr>
-          <w:p>
-            <w:pPr>
-              <w:spacing w:line="360" w:lineRule="auto"/>
-              <w:ind w:firstLine="0"/>
-              <w:jc w:val="left"/>
-              <w:rPr>
-                <w:rFonts w:ascii="Times New Roman" w:eastAsia="Times New Roman" w:hAnsi="Times New Roman" w:cs="Times New Roman"/>
-                <w:b/>
-                <w:bCs/>
-                <w:kern w:val="0"/>
-                <w:sz w:val="26"/>
-                <w:szCs w:val="26"/>
-                <w14:ligatures w14:val="none"/>
-              </w:rPr>
-            </w:pPr>
-          </w:p>
-        </w:tc>
-        <w:tc>
-          <w:tcPr>
-            <w:tcW w:w="1870" w:type="dxa"/>
-          </w:tcPr>
-          <w:p>
-            <w:pPr>
-              <w:spacing w:line="360" w:lineRule="auto"/>
-              <w:ind w:firstLine="0"/>
-              <w:jc w:val="left"/>
-              <w:rPr>
-                <w:rFonts w:ascii="Times New Roman" w:eastAsia="Times New Roman" w:hAnsi="Times New Roman" w:cs="Times New Roman"/>
-                <w:b/>
-                <w:bCs/>
-                <w:kern w:val="0"/>
-                <w:sz w:val="26"/>
-                <w:szCs w:val="26"/>
-                <w14:ligatures w14:val="none"/>
-              </w:rPr>
-            </w:pPr>
-          </w:p>
-        </w:tc>
-        <w:tc>
-          <w:tcPr>
-            <w:tcW w:w="1870" w:type="dxa"/>
-          </w:tcPr>
-          <w:p>
-            <w:pPr>
-              <w:spacing w:line="360" w:lineRule="auto"/>
-              <w:ind w:firstLine="0"/>
-              <w:jc w:val="left"/>
-              <w:rPr>
-                <w:rFonts w:ascii="Times New Roman" w:eastAsia="Times New Roman" w:hAnsi="Times New Roman" w:cs="Times New Roman"/>
-                <w:b/>
-                <w:bCs/>
-                <w:kern w:val="0"/>
-                <w:sz w:val="26"/>
-                <w:szCs w:val="26"/>
-                <w14:ligatures w14:val="none"/>
-              </w:rPr>
-            </w:pPr>
           </w:p>
         </w:tc>
       </w:tr>

</xml_diff>